<commit_message>
court(va): petition for appeal engines regenerated on the current model, closing kept with the last paragraph; still reported (fb-595.54.35)
Co-Authored-By: Claude Opus 5.5 <noreply@anthropic.com>
</commit_message>
<xml_diff>
--- a/courts/fourth-circuit/virginia/state/supreme-court/petition-for-discretionary-review/usage/OUTPUT-petition-for-discretionary-review.docx
+++ b/courts/fourth-circuit/virginia/state/supreme-court/petition-for-discretionary-review/usage/OUTPUT-petition-for-discretionary-review.docx
@@ -2072,9 +2072,7 @@
         <w:t xml:space="preserve"> </w:t>
       </w:r>
       <w:r>
-        <w:t xml:space="preserve">2.2</w:t>
-        <w:noBreakHyphen/>
-        <w:t xml:space="preserve">3801</w:t>
+        <w:t xml:space="preserve">2.2-⁠3801</w:t>
       </w:r>
       <w:r>
         <w:t xml:space="preserve"> </w:t>
@@ -6550,13 +6548,7 @@
         <w:t xml:space="preserve">I</w:t>
       </w:r>
       <w:r>
-        <w:t xml:space="preserve">). The Court specifically tasked the circuit court with determining whether “the ALPR record-keeping process” constitutes an “information system” subject to the Government Data Collection and Dissemination Practices Act (the “Data Act”), Va. Code Ann. §§ 2.2</w:t>
-      </w:r>
-      <w:r>
-        <w:noBreakHyphen/>
-      </w:r>
-      <w:r>
-        <w:t xml:space="preserve">3800–3809</w:t>
+        <w:t xml:space="preserve">). The Court specifically tasked the circuit court with determining whether “the ALPR record-keeping process” constitutes an “information system” subject to the Government Data Collection and Dissemination Practices Act (the “Data Act”), Va. Code Ann. §§ 2.2-⁠3800–⁠3809</w:t>
       </w:r>
       <w:r>
         <w:t xml:space="preserve"> </w:t>
@@ -6589,7 +6581,7 @@
         <w:t xml:space="preserve">I</w:t>
       </w:r>
       <w:r>
-        <w:t xml:space="preserve">, 295 Va. at 350. According to the Court, that determination turns on whether the “total components and operations of the ALPR record-keeping process” provide a “means”—“as part of the . . . process”—for a “link” to be “readily made” between a license-plate number and the owner of the vehicle.</w:t>
+        <w:t xml:space="preserve">, 295 Va. at 350. According to the Court, that determination turns on whether the “total components and operations of the ALPR record-keeping process” provide a “means”—“as part of the . . . process”—for a “link” to be “readily made” between a license-plate number and the owner of the vehicle.</w:t>
       </w:r>
       <w:r>
         <w:t xml:space="preserve"> </w:t>
@@ -6907,13 +6899,7 @@
         <w:t xml:space="preserve"> </w:t>
       </w:r>
       <w:r>
-        <w:t xml:space="preserve">motion, memorandum, and supporting exhibits). The trial court granted summary judgment to the Department, concluding that the license-plate numbers stored as part of the ALPR record-keeping process are not “personal information” under Code § 2.2</w:t>
-      </w:r>
-      <w:r>
-        <w:noBreakHyphen/>
-      </w:r>
-      <w:r>
-        <w:t xml:space="preserve">3801.</w:t>
+        <w:t xml:space="preserve">motion, memorandum, and supporting exhibits). The trial court granted summary judgment to the Department, concluding that the license-plate numbers stored as part of the ALPR record-keeping process are not “personal information” under Code § 2.2-⁠3801.</w:t>
       </w:r>
       <w:r>
         <w:t xml:space="preserve"> </w:t>
@@ -6980,13 +6966,7 @@
         <w:t xml:space="preserve">I</w:t>
       </w:r>
       <w:r>
-        <w:t xml:space="preserve">, 295 Va. 334. The Court agreed that “a license plate number stored in the ALPR database would not be personal information [under Code § 2.2</w:t>
-      </w:r>
-      <w:r>
-        <w:noBreakHyphen/>
-      </w:r>
-      <w:r>
-        <w:t xml:space="preserve">3801]</w:t>
+        <w:t xml:space="preserve">, 295 Va. 334. The Court agreed that “a license plate number stored in the ALPR database would not be personal information [under Code § 2.2-⁠3801]</w:t>
       </w:r>
       <w:r>
         <w:t xml:space="preserve"> </w:t>
@@ -7032,13 +7012,7 @@
         <w:pStyle w:val="BodyText"/>
       </w:pPr>
       <w:r>
-        <w:t xml:space="preserve">The Court then considered whether the ALPR record-keeping process constituted an “information system” under Code § 2.2</w:t>
-      </w:r>
-      <w:r>
-        <w:noBreakHyphen/>
-      </w:r>
-      <w:r>
-        <w:t xml:space="preserve">3801.</w:t>
+        <w:t xml:space="preserve">The Court then considered whether the ALPR record-keeping process constituted an “information system” under Code § 2.2-⁠3801.</w:t>
       </w:r>
       <w:r>
         <w:t xml:space="preserve"> </w:t>
@@ -7126,7 +7100,7 @@
         <w:t xml:space="preserve"> </w:t>
       </w:r>
       <w:r>
-        <w:t xml:space="preserve">The Court reasoned that, because the “ALPR information . . . ha[d] not been deemed part of any specific law enforcement investigation or purpose” at the time that the data was recorded and stored, the Data Act’s exemption for information systems involving “investigations and intelligence gathering related to criminal activity” did not apply.</w:t>
+        <w:t xml:space="preserve">The Court reasoned that, because the “ALPR information . . . ha[d] not been deemed part of any specific law enforcement investigation or purpose” at the time that the data was recorded and stored, the Data Act’s exemption for information systems involving “investigations and intelligence gathering related to criminal activity” did not apply.</w:t>
       </w:r>
       <w:r>
         <w:t xml:space="preserve"> </w:t>
@@ -7224,13 +7198,7 @@
         <w:t xml:space="preserve"> </w:t>
       </w:r>
       <w:r>
-        <w:t xml:space="preserve">at 350; R. 1405–1845. On April 1, 2019, the circuit court issued a letter opinion concluding that the ALPR record-keeping process was an “information system” under Code § 2.2</w:t>
-      </w:r>
-      <w:r>
-        <w:noBreakHyphen/>
-      </w:r>
-      <w:r>
-        <w:t xml:space="preserve">3801.</w:t>
+        <w:t xml:space="preserve">at 350; R. 1405–1845. On April 1, 2019, the circuit court issued a letter opinion concluding that the ALPR record-keeping process was an “information system” under Code § 2.2-⁠3801.</w:t>
       </w:r>
       <w:r>
         <w:t xml:space="preserve"> </w:t>
@@ -7312,13 +7280,7 @@
         <w:pStyle w:val="BodyTextNote"/>
       </w:pPr>
       <w:r>
-        <w:t xml:space="preserve">1. The circuit court erred in concluding that the Department’s ALPR system is an “information system” under the Data Act because the ALPR system does not itself contain “the name, personal number, or other identifying particulars of a data subject.” Va. Code Ann. § 2.2</w:t>
-      </w:r>
-      <w:r>
-        <w:noBreakHyphen/>
-      </w:r>
-      <w:r>
-        <w:t xml:space="preserve">3801.</w:t>
+        <w:t xml:space="preserve">1. The circuit court erred in concluding that the Department’s ALPR system is an “information system” under the Data Act because the ALPR system does not itself contain “the name, personal number, or other identifying particulars of a data subject.” Va. Code Ann. § 2.2-⁠3801.</w:t>
       </w:r>
       <w:r>
         <w:t xml:space="preserve"> </w:t>
@@ -7336,13 +7298,7 @@
         <w:t xml:space="preserve"> </w:t>
       </w:r>
       <w:r>
-        <w:t xml:space="preserve">If the ALPR system is construed to include information that the Department could potentially access through the NCIC, VCIN, and the DMV databases, which can only be accessed with a valid criminal justice purpose, then the Court should decide anew, based on the changed factual predicate, whether the ALPR system is exempt under Code § 2.2</w:t>
-      </w:r>
-      <w:r>
-        <w:noBreakHyphen/>
-      </w:r>
-      <w:r>
-        <w:t xml:space="preserve">3802(7)</w:t>
+        <w:t xml:space="preserve">If the ALPR system is construed to include information that the Department could potentially access through the NCIC, VCIN, and the DMV databases, which can only be accessed with a valid criminal justice purpose, then the Court should decide anew, based on the changed factual predicate, whether the ALPR system is exempt under Code § 2.2-⁠3802(7)</w:t>
       </w:r>
       <w:r>
         <w:t xml:space="preserve"> </w:t>
@@ -7757,7 +7713,7 @@
         <w:t xml:space="preserve"> </w:t>
       </w:r>
       <w:r>
-        <w:t xml:space="preserve">R. 2162. The hardware also includes “a computer in the trunk of a police cruiser that converts the images of license plates, taken by the cameras, into letter/​number combination sequences.” R. 865. Through an Ethernet cable, the computer relays the converted data “to the laptop computer . . . in the front of the cruiser.”</w:t>
+        <w:t xml:space="preserve">R. 2162. The hardware also includes “a computer in the trunk of a police cruiser that converts the images of license plates, taken by the cameras, into letter/​number combination sequences.” R. 865. Through an Ethernet cable, the computer relays the converted data “to the laptop computer . . . in the front of the cruiser.”</w:t>
       </w:r>
       <w:r>
         <w:t xml:space="preserve"> </w:t>
@@ -7838,7 +7794,7 @@
         <w:t xml:space="preserve"> </w:t>
       </w:r>
       <w:r>
-        <w:t xml:space="preserve">gather or directly connect to ‘identifying particulars’ of a vehicle owner . . . .” R. 866 (emphasis in original);</w:t>
+        <w:t xml:space="preserve">gather or directly connect to ‘identifying particulars’ of a vehicle owner . . . .” R. 866 (emphasis in original);</w:t>
       </w:r>
       <w:r>
         <w:t xml:space="preserve"> </w:t>
@@ -8739,7 +8695,7 @@
         <w:t xml:space="preserve"> </w:t>
       </w:r>
       <w:r>
-        <w:t xml:space="preserve">R. 1785 (“Q. Is there any interface between the I/​Mobile software on the laptop in the cruiser and the Fairfax County Police Department LPR software? . . . . The Witness: There [is] no link whatsoever.”). “[W]hile an officer can access all [of those] databases from the same computer, human intervention is required to match personal, identifying information from one database with the license plate number in the ALPR database.” R. 865.</w:t>
+        <w:t xml:space="preserve">R. 1785 (“Q. Is there any interface between the I/​Mobile software on the laptop in the cruiser and the Fairfax County Police Department LPR software? . . . . The Witness: There [is] no link whatsoever.”). “[W]hile an officer can access all [of those] databases from the same computer, human intervention is required to match personal, identifying information from one database with the license plate number in the ALPR database.” R. 865.</w:t>
       </w:r>
     </w:p>
     <w:p>
@@ -8819,13 +8775,7 @@
         <w:t xml:space="preserve"> </w:t>
       </w:r>
       <w:r>
-        <w:t xml:space="preserve">R. 1763–64. Accessing the NCIC, VCIN, or DMV databases without a legitimate criminal justice purpose is a criminal violation. Va. Code Ann. § 18.2</w:t>
-      </w:r>
-      <w:r>
-        <w:noBreakHyphen/>
-      </w:r>
-      <w:r>
-        <w:t xml:space="preserve">152.5;</w:t>
+        <w:t xml:space="preserve">R. 1763–64. Accessing the NCIC, VCIN, or DMV databases without a legitimate criminal justice purpose is a criminal violation. Va. Code Ann. § 18.2-⁠152.5;</w:t>
       </w:r>
       <w:r>
         <w:t xml:space="preserve"> </w:t>
@@ -8854,13 +8804,7 @@
         <w:t xml:space="preserve"> </w:t>
       </w:r>
       <w:r>
-        <w:t xml:space="preserve">694, 701 (2015) (affirming conviction for a state police officer under § 18.2</w:t>
-      </w:r>
-      <w:r>
-        <w:noBreakHyphen/>
-      </w:r>
-      <w:r>
-        <w:t xml:space="preserve">152.5</w:t>
+        <w:t xml:space="preserve">694, 701 (2015) (affirming conviction for a state police officer under § 18.2-⁠152.5</w:t>
       </w:r>
       <w:r>
         <w:t xml:space="preserve"> </w:t>
@@ -8918,7 +8862,7 @@
         <w:pStyle w:val="BodyText"/>
       </w:pPr>
       <w:r>
-        <w:t xml:space="preserve">Although not challenged here, the circuit court’s factual findings are reviewed “with the highest degree of appellate deference” and “in the light most favorable to . . . the prevailing party at trial.”</w:t>
+        <w:t xml:space="preserve">Although not challenged here, the circuit court’s factual findings are reviewed “with the highest degree of appellate deference” and “in the light most favorable to . . . the prevailing party at trial.”</w:t>
       </w:r>
       <w:r>
         <w:t xml:space="preserve"> </w:t>
@@ -8937,7 +8881,7 @@
         <w:t xml:space="preserve"> </w:t>
       </w:r>
       <w:r>
-        <w:t xml:space="preserve">158–59 (2017). “The circuit court’s findings of fact . . . will not be disturbed unless they are plainly wrong or without supporting evidence.”</w:t>
+        <w:t xml:space="preserve">158–59 (2017). “The circuit court’s findings of fact . . . will not be disturbed unless they are plainly wrong or without supporting evidence.”</w:t>
       </w:r>
       <w:r>
         <w:t xml:space="preserve"> </w:t>
@@ -8964,13 +8908,7 @@
         <w:pStyle w:val="BodyText"/>
       </w:pPr>
       <w:r>
-        <w:t xml:space="preserve">On the other hand, how to interpret the definition of “information system” in Code § 2.2</w:t>
-      </w:r>
-      <w:r>
-        <w:noBreakHyphen/>
-      </w:r>
-      <w:r>
-        <w:t xml:space="preserve">3801</w:t>
+        <w:t xml:space="preserve">On the other hand, how to interpret the definition of “information system” in Code § 2.2-⁠3801</w:t>
       </w:r>
       <w:r>
         <w:t xml:space="preserve"> </w:t>
@@ -9041,7 +8979,7 @@
         <w:t xml:space="preserve"> </w:t>
       </w:r>
       <w:r>
-        <w:t xml:space="preserve">1, 18 (2019). But the trial court “abuses its discretion if . . . its action or its decision was based on erroneous legal conclusions.”</w:t>
+        <w:t xml:space="preserve">1, 18 (2019). But the trial court “abuses its discretion if . . . its action or its decision was based on erroneous legal conclusions.”</w:t>
       </w:r>
       <w:r>
         <w:t xml:space="preserve"> </w:t>
@@ -9713,13 +9651,7 @@
         <w:pStyle w:val="BodyText"/>
       </w:pPr>
       <w:r>
-        <w:t xml:space="preserve">The Department’s ALPR system is the only record-keeping process relevant to this case. The Data Act is laser-focused on “a”—singular—“record-keeping process.” Va. Code Ann. § 2.2</w:t>
-      </w:r>
-      <w:r>
-        <w:noBreakHyphen/>
-      </w:r>
-      <w:r>
-        <w:t xml:space="preserve">3801.</w:t>
+        <w:t xml:space="preserve">The Department’s ALPR system is the only record-keeping process relevant to this case. The Data Act is laser-focused on “a”—singular—“record-keeping process.” Va. Code Ann. § 2.2-⁠3801.</w:t>
       </w:r>
       <w:r>
         <w:t xml:space="preserve"> </w:t>
@@ -9840,9 +9772,7 @@
           <w:i/>
           <w:iCs/>
         </w:rPr>
-        <w:t xml:space="preserve">2.2</w:t>
-        <w:noBreakHyphen/>
-        <w:t xml:space="preserve">3801</w:t>
+        <w:t xml:space="preserve">2.2-⁠3801</w:t>
       </w:r>
       <w:r>
         <w:rPr>
@@ -10194,13 +10124,7 @@
         <w:pStyle w:val="BodyText"/>
       </w:pPr>
       <w:r>
-        <w:t xml:space="preserve">Here, the key phrase in Code § 2.2</w:t>
-      </w:r>
-      <w:r>
-        <w:noBreakHyphen/>
-      </w:r>
-      <w:r>
-        <w:t xml:space="preserve">3801</w:t>
+        <w:t xml:space="preserve">Here, the key phrase in Code § 2.2-⁠3801</w:t>
       </w:r>
       <w:r>
         <w:t xml:space="preserve"> </w:t>
@@ -10269,13 +10193,7 @@
         <w:t xml:space="preserve">and</w:t>
       </w:r>
       <w:r>
-        <w:t xml:space="preserve">” a person’s “name, personal number, or other identifying particulars,” on the other. Va. Code Ann. § 2.2</w:t>
-      </w:r>
-      <w:r>
-        <w:noBreakHyphen/>
-      </w:r>
-      <w:r>
-        <w:t xml:space="preserve">3801</w:t>
+        <w:t xml:space="preserve">” a person’s “name, personal number, or other identifying particulars,” on the other. Va. Code Ann. § 2.2-⁠3801</w:t>
       </w:r>
       <w:r>
         <w:t xml:space="preserve"> </w:t>
@@ -10289,25 +10207,13 @@
         <w:pStyle w:val="BodyText"/>
       </w:pPr>
       <w:r>
-        <w:t xml:space="preserve">Although the general rule is that “the singular includes the plural,” Va. Code Ann. § 1</w:t>
-      </w:r>
-      <w:r>
-        <w:noBreakHyphen/>
-      </w:r>
-      <w:r>
-        <w:t xml:space="preserve">227,</w:t>
-      </w:r>
-      <w:r>
-        <w:t xml:space="preserve"> </w:t>
-      </w:r>
-      <w:r>
-        <w:t xml:space="preserve">that rule gives way when, as here, it is “inconsistent with the manifest intention of the General Assembly,” Va. Code Ann. § 1</w:t>
-      </w:r>
-      <w:r>
-        <w:noBreakHyphen/>
-      </w:r>
-      <w:r>
-        <w:t xml:space="preserve">202.</w:t>
+        <w:t xml:space="preserve">Although the general rule is that “the singular includes the plural,” Va. Code Ann. § 1-⁠227,</w:t>
+      </w:r>
+      <w:r>
+        <w:t xml:space="preserve"> </w:t>
+      </w:r>
+      <w:r>
+        <w:t xml:space="preserve">that rule gives way when, as here, it is “inconsistent with the manifest intention of the General Assembly,” Va. Code Ann. § 1-⁠202.</w:t>
       </w:r>
       <w:r>
         <w:t xml:space="preserve"> </w:t>
@@ -10391,13 +10297,7 @@
         <w:pStyle w:val="BodyText"/>
       </w:pPr>
       <w:r>
-        <w:t xml:space="preserve">Doing so would also make the Data Act’s requirements unpredictable, frustrating the good-faith efforts of governmental bodies to comply with it. For example, under Code § 2.2</w:t>
-      </w:r>
-      <w:r>
-        <w:noBreakHyphen/>
-      </w:r>
-      <w:r>
-        <w:t xml:space="preserve">3803,</w:t>
+        <w:t xml:space="preserve">Doing so would also make the Data Act’s requirements unpredictable, frustrating the good-faith efforts of governmental bodies to comply with it. For example, under Code § 2.2-⁠3803,</w:t>
       </w:r>
       <w:r>
         <w:t xml:space="preserve"> </w:t>
@@ -10411,13 +10311,7 @@
         <w:pStyle w:val="BodyText"/>
       </w:pPr>
       <w:r>
-        <w:t xml:space="preserve">“[m]aintain information in the system with accuracy, completeness, timeliness, and pertinence as necessary to ensure fairness in determinations relating to a data subject,” Va. Code Ann. § 2.2</w:t>
-      </w:r>
-      <w:r>
-        <w:noBreakHyphen/>
-      </w:r>
-      <w:r>
-        <w:t xml:space="preserve">3803(4);</w:t>
+        <w:t xml:space="preserve">“[m]aintain information in the system with accuracy, completeness, timeliness, and pertinence as necessary to ensure fairness in determinations relating to a data subject,” Va. Code Ann. § 2.2-⁠3803(4);</w:t>
       </w:r>
     </w:p>
     <w:p>
@@ -10425,13 +10319,7 @@
         <w:pStyle w:val="BodyText"/>
       </w:pPr>
       <w:r>
-        <w:t xml:space="preserve">“[m]aintain a list of all persons or organizations having regular access to personal information in the information system,” Va. Code Ann. § 2.2</w:t>
-      </w:r>
-      <w:r>
-        <w:noBreakHyphen/>
-      </w:r>
-      <w:r>
-        <w:t xml:space="preserve">3803(6);</w:t>
+        <w:t xml:space="preserve">“[m]aintain a list of all persons or organizations having regular access to personal information in the information system,” Va. Code Ann. § 2.2-⁠3803(6);</w:t>
       </w:r>
       <w:r>
         <w:t xml:space="preserve"> </w:t>
@@ -10445,13 +10333,7 @@
         <w:pStyle w:val="BodyText"/>
       </w:pPr>
       <w:r>
-        <w:t xml:space="preserve">“[m]aintain for a period of three years or until such time as personal information is purged, whichever is shorter, a complete and accurate record, including identity and purpose, of every access to any personal information in a system . . . .” Va. Code Ann. § 2.2</w:t>
-      </w:r>
-      <w:r>
-        <w:noBreakHyphen/>
-      </w:r>
-      <w:r>
-        <w:t xml:space="preserve">3803(7).</w:t>
+        <w:t xml:space="preserve">“[m]aintain for a period of three years or until such time as personal information is purged, whichever is shorter, a complete and accurate record, including identity and purpose, of every access to any personal information in a system . . . .” Va. Code Ann. § 2.2-⁠3803(7).</w:t>
       </w:r>
     </w:p>
     <w:p>
@@ -10472,13 +10354,7 @@
         <w:t xml:space="preserve">See, e.g.</w:t>
       </w:r>
       <w:r>
-        <w:t xml:space="preserve">, Va. Code Ann. § 2.2</w:t>
-      </w:r>
-      <w:r>
-        <w:noBreakHyphen/>
-      </w:r>
-      <w:r>
-        <w:t xml:space="preserve">3806(A)⁠(5)⁠(a)</w:t>
+        <w:t xml:space="preserve">, Va. Code Ann. § 2.2-⁠3806(A)⁠(5)⁠(a)</w:t>
       </w:r>
       <w:r>
         <w:t xml:space="preserve"> </w:t>
@@ -10500,13 +10376,7 @@
         <w:t xml:space="preserve"> </w:t>
       </w:r>
       <w:r>
-        <w:t xml:space="preserve">§ 2.2</w:t>
-      </w:r>
-      <w:r>
-        <w:noBreakHyphen/>
-      </w:r>
-      <w:r>
-        <w:t xml:space="preserve">3806(A)⁠(5)⁠(e)</w:t>
+        <w:t xml:space="preserve">§ 2.2-⁠3806(A)⁠(5)⁠(e)</w:t>
       </w:r>
       <w:r>
         <w:t xml:space="preserve"> </w:t>
@@ -10552,13 +10422,7 @@
         <w:pStyle w:val="BodyText"/>
       </w:pPr>
       <w:r>
-        <w:t xml:space="preserve">Indeed, the circuit court’s sweeping interpretation of what constitutes an “information system” under the Data Act leads to plainly absurd results. Unless exempt under Code § 2.2</w:t>
-      </w:r>
-      <w:r>
-        <w:noBreakHyphen/>
-      </w:r>
-      <w:r>
-        <w:t xml:space="preserve">3802,</w:t>
+        <w:t xml:space="preserve">Indeed, the circuit court’s sweeping interpretation of what constitutes an “information system” under the Data Act leads to plainly absurd results. Unless exempt under Code § 2.2-⁠3802,</w:t>
       </w:r>
       <w:r>
         <w:t xml:space="preserve"> </w:t>
@@ -10580,13 +10444,7 @@
         <w:t xml:space="preserve"> </w:t>
       </w:r>
       <w:r>
-        <w:t xml:space="preserve">databases containing “the name, personal number, or other identifying particulars of a data subject.” Va. Code Ann. § 2.2</w:t>
-      </w:r>
-      <w:r>
-        <w:noBreakHyphen/>
-      </w:r>
-      <w:r>
-        <w:t xml:space="preserve">3801;</w:t>
+        <w:t xml:space="preserve">databases containing “the name, personal number, or other identifying particulars of a data subject.” Va. Code Ann. § 2.2-⁠3801;</w:t>
       </w:r>
       <w:r>
         <w:t xml:space="preserve"> </w:t>
@@ -10602,13 +10460,7 @@
         <w:t xml:space="preserve"> </w:t>
       </w:r>
       <w:r>
-        <w:t xml:space="preserve">R. 1912–13 (noting that the trial court’s expansive interpretation of “information system” would apply to “a camera system outside the courthouse,” which passively “collects the license plate numbers of vehicles that drive past the courthouse”). That unbounded reading would eviscerate the requirement in § 2.2</w:t>
-      </w:r>
-      <w:r>
-        <w:noBreakHyphen/>
-      </w:r>
-      <w:r>
-        <w:t xml:space="preserve">3801</w:t>
+        <w:t xml:space="preserve">R. 1912–13 (noting that the trial court’s expansive interpretation of “information system” would apply to “a camera system outside the courthouse,” which passively “collects the license plate numbers of vehicles that drive past the courthouse”). That unbounded reading would eviscerate the requirement in § 2.2-⁠3801</w:t>
       </w:r>
       <w:r>
         <w:t xml:space="preserve"> </w:t>
@@ -10792,7 +10644,7 @@
         <w:pStyle w:val="BodyText"/>
       </w:pPr>
       <w:r>
-        <w:t xml:space="preserve">As license-plate images are recorded by the ALPR cameras, the computer in the trunk “converts the images . . . into letter/​number combination sequences.”</w:t>
+        <w:t xml:space="preserve">As license-plate images are recorded by the ALPR cameras, the computer in the trunk “converts the images . . . into letter/​number combination sequences.”</w:t>
       </w:r>
       <w:r>
         <w:t xml:space="preserve"> </w:t>
@@ -10884,13 +10736,7 @@
         <w:pStyle w:val="BodyText"/>
       </w:pPr>
       <w:r>
-        <w:t xml:space="preserve">In short, “no less than two computer programs and three passwords” are required before a license-plate number maintained in the ALPR system can be used to identify a vehicle’s owner. R. 865–66. The trial court erred by finding that such an attenuated connection between the license-plate number and the owner’s identity could suffice to render the ALPR record-keeping process an “information system” under Code § 2.2</w:t>
-      </w:r>
-      <w:r>
-        <w:noBreakHyphen/>
-      </w:r>
-      <w:r>
-        <w:t xml:space="preserve">3801.</w:t>
+        <w:t xml:space="preserve">In short, “no less than two computer programs and three passwords” are required before a license-plate number maintained in the ALPR system can be used to identify a vehicle’s owner. R. 865–66. The trial court erred by finding that such an attenuated connection between the license-plate number and the owner’s identity could suffice to render the ALPR record-keeping process an “information system” under Code § 2.2-⁠3801.</w:t>
       </w:r>
     </w:p>
     <w:p>
@@ -11205,8 +11051,6 @@
         <w:rPr>
           <w:b/>
           <w:bCs/>
-          <w:i/>
-          <w:iCs/>
         </w:rPr>
         <w:t xml:space="preserve">Neal</w:t>
       </w:r>
@@ -11214,17 +11058,13 @@
         <w:rPr>
           <w:b/>
           <w:bCs/>
-          <w:i/>
-          <w:iCs/>
-        </w:rPr>
-        <w:t xml:space="preserve"> </w:t>
-      </w:r>
-      <w:r>
-        <w:rPr>
-          <w:b/>
-          <w:bCs/>
-          <w:i/>
-          <w:iCs/>
+        </w:rPr>
+        <w:t xml:space="preserve"> </w:t>
+      </w:r>
+      <w:r>
+        <w:rPr>
+          <w:b/>
+          <w:bCs/>
         </w:rPr>
         <w:t xml:space="preserve">I</w:t>
       </w:r>
@@ -11991,13 +11831,7 @@
         <w:t xml:space="preserve"> </w:t>
       </w:r>
       <w:r>
-        <w:t xml:space="preserve">at 350. As the Data Act makes clear, “information systems . . . that deal with investigations and intelligence gathering related to criminal activity” are exempt from the Data Act. Va. Code Ann. § 2.2</w:t>
-      </w:r>
-      <w:r>
-        <w:noBreakHyphen/>
-      </w:r>
-      <w:r>
-        <w:t xml:space="preserve">3802(7)</w:t>
+        <w:t xml:space="preserve">at 350. As the Data Act makes clear, “information systems . . . that deal with investigations and intelligence gathering related to criminal activity” are exempt from the Data Act. Va. Code Ann. § 2.2-⁠3802(7)</w:t>
       </w:r>
       <w:r>
         <w:t xml:space="preserve"> </w:t>
@@ -12084,13 +11918,7 @@
         <w:t xml:space="preserve"> </w:t>
       </w:r>
       <w:r>
-        <w:t xml:space="preserve">when they have a legitimate criminal justice purpose for doing so. Indeed, Code § 18.2</w:t>
-      </w:r>
-      <w:r>
-        <w:noBreakHyphen/>
-      </w:r>
-      <w:r>
-        <w:t xml:space="preserve">152.5</w:t>
+        <w:t xml:space="preserve">when they have a legitimate criminal justice purpose for doing so. Indeed, Code § 18.2-⁠152.5</w:t>
       </w:r>
       <w:r>
         <w:t xml:space="preserve"> </w:t>
@@ -12159,25 +11987,13 @@
         <w:t xml:space="preserve"> </w:t>
       </w:r>
       <w:r>
-        <w:t xml:space="preserve">nor the trial court addressed the requirement that an officer have a “criminal justice purpose” before taking license-plate data gleaned from the ALPR system and running it through the NCIC, VCIN, and DMV databases to discover the owner’s identity. Va. Code Ann. § 2.2</w:t>
-      </w:r>
-      <w:r>
-        <w:noBreakHyphen/>
-      </w:r>
-      <w:r>
-        <w:t xml:space="preserve">3801.</w:t>
-      </w:r>
-      <w:r>
-        <w:t xml:space="preserve"> </w:t>
-      </w:r>
-      <w:r>
-        <w:t xml:space="preserve">So if the trial court is right that the ALPR record-keeping process encompasses information accessible in those databases, the Court would need to decide anew, based on the changed factual predicate, whether the ALPR “information system” is exempt from the Data Act under Code § 2.2</w:t>
-      </w:r>
-      <w:r>
-        <w:noBreakHyphen/>
-      </w:r>
-      <w:r>
-        <w:t xml:space="preserve">3802(7).</w:t>
+        <w:t xml:space="preserve">nor the trial court addressed the requirement that an officer have a “criminal justice purpose” before taking license-plate data gleaned from the ALPR system and running it through the NCIC, VCIN, and DMV databases to discover the owner’s identity. Va. Code Ann. § 2.2-⁠3801.</w:t>
+      </w:r>
+      <w:r>
+        <w:t xml:space="preserve"> </w:t>
+      </w:r>
+      <w:r>
+        <w:t xml:space="preserve">So if the trial court is right that the ALPR record-keeping process encompasses information accessible in those databases, the Court would need to decide anew, based on the changed factual predicate, whether the ALPR “information system” is exempt from the Data Act under Code § 2.2-⁠3802(7).</w:t>
       </w:r>
     </w:p>
     <w:p>
@@ -12607,13 +12423,7 @@
         <w:pStyle w:val="BodyText"/>
       </w:pPr>
       <w:r>
-        <w:t xml:space="preserve">Even if the ALPR system could be defined as an “information system” under Code § 2.2</w:t>
-      </w:r>
-      <w:r>
-        <w:noBreakHyphen/>
-      </w:r>
-      <w:r>
-        <w:t xml:space="preserve">3801,</w:t>
+        <w:t xml:space="preserve">Even if the ALPR system could be defined as an “information system” under Code § 2.2-⁠3801,</w:t>
       </w:r>
       <w:r>
         <w:t xml:space="preserve"> </w:t>
@@ -12650,7 +12460,7 @@
         <w:t xml:space="preserve"> </w:t>
       </w:r>
       <w:r>
-        <w:t xml:space="preserve">failed to meet his burden to show that the Data Act categorically bans such data collection, the court erred in finding that the “Department’s ‘passive use’ of the ALPR system . . . violates the Data Act.” R. 866.</w:t>
+        <w:t xml:space="preserve">failed to meet his burden to show that the Data Act categorically bans such data collection, the court erred in finding that the “Department’s ‘passive use’ of the ALPR system . . . violates the Data Act.” R. 866.</w:t>
       </w:r>
     </w:p>
     <w:p>
@@ -13104,13 +12914,7 @@
         <w:t xml:space="preserve">i.e.</w:t>
       </w:r>
       <w:r>
-        <w:t xml:space="preserve">, irreparable harm and lack of an adequate remedy at law,” before issuing an injunction under Code § 2.2</w:t>
-      </w:r>
-      <w:r>
-        <w:noBreakHyphen/>
-      </w:r>
-      <w:r>
-        <w:t xml:space="preserve">3809.</w:t>
+        <w:t xml:space="preserve">, irreparable harm and lack of an adequate remedy at law,” before issuing an injunction under Code § 2.2-⁠3809.</w:t>
       </w:r>
       <w:r>
         <w:t xml:space="preserve"> </w:t>
@@ -13139,13 +12943,7 @@
         <w:t xml:space="preserve"> </w:t>
       </w:r>
       <w:r>
-        <w:t xml:space="preserve">349, 354 (1985). But the court’s injunction must be specific and tailored to remedy an actual violation of the statute. Va. Code Ann. § 2.2</w:t>
-      </w:r>
-      <w:r>
-        <w:noBreakHyphen/>
-      </w:r>
-      <w:r>
-        <w:t xml:space="preserve">3809</w:t>
+        <w:t xml:space="preserve">349, 354 (1985). But the court’s injunction must be specific and tailored to remedy an actual violation of the statute. Va. Code Ann. § 2.2-⁠3809</w:t>
       </w:r>
       <w:r>
         <w:t xml:space="preserve"> </w:t>
@@ -13384,13 +13182,7 @@
         <w:pStyle w:val="BodyText"/>
       </w:pPr>
       <w:r>
-        <w:t xml:space="preserve">The petition for appeal should be granted. The circuit court committed legal error by concluding that the ALPR record-keeping process constitutes an “information system” under Code § 2.2</w:t>
-      </w:r>
-      <w:r>
-        <w:noBreakHyphen/>
-      </w:r>
-      <w:r>
-        <w:t xml:space="preserve">3801</w:t>
+        <w:t xml:space="preserve">The petition for appeal should be granted. The circuit court committed legal error by concluding that the ALPR record-keeping process constitutes an “information system” under Code § 2.2-⁠3801</w:t>
       </w:r>
       <w:r>
         <w:t xml:space="preserve"> </w:t>
@@ -13401,7 +13193,7 @@
     </w:p>
     <w:p>
       <w:pPr>
-        <w:pStyle w:val="BodyText"/>
+        <w:pStyle w:val="BodyTextKeep"/>
       </w:pPr>
       <w:r>
         <w:t xml:space="preserve">The Court should grant review, reverse, and enter final judgment.</w:t>
@@ -13409,6 +13201,8 @@
     </w:p>
     <w:p>
       <w:pPr>
+        <w:keepNext/>
+        <w:keepLines/>
         <w:spacing w:before="0" w:after="0" w:line="336" w:lineRule="exact"/>
       </w:pPr>
     </w:p>
@@ -14933,7 +14727,7 @@
         <w:t xml:space="preserve"> </w:t>
       </w:r>
       <w:r>
-        <w:t xml:space="preserve">(“cumulative data usu[ally] consisting of written, systematically arranged notes relating to an individual’s or group’s activities . . . .”). And, lastly, the verb “keep” is defined as “to maintain a record in (as of daily occurrences or transactions).”</w:t>
+        <w:t xml:space="preserve">(“cumulative data usu[ally] consisting of written, systematically arranged notes relating to an individual’s or group’s activities . . . .”). And, lastly, the verb “keep” is defined as “to maintain a record in (as of daily occurrences or transactions).”</w:t>
       </w:r>
       <w:r>
         <w:t xml:space="preserve"> </w:t>
@@ -15022,7 +14816,7 @@
         <w:t xml:space="preserve"> </w:t>
       </w:r>
       <w:r>
-        <w:t xml:space="preserve">S.B. No. 965 (Va. 2015), https://​​lis.​virginia.​gov/​​cgi-​bin/​​legp604.​exe?151+ful+SB965ER.</w:t>
+        <w:t xml:space="preserve">S.B. No. 965 (Va. 2015), https://​lis.​virginia.​gov/​cgi-​bin/​legp604.​exe?​151+ful+SB965ER.</w:t>
       </w:r>
     </w:p>
   </w:footnote>
@@ -15041,13 +14835,7 @@
         <w:t xml:space="preserve"> </w:t>
       </w:r>
       <w:r>
-        <w:t xml:space="preserve">The fact that this Court denied the Department’s petition for review of the injunction under Code § 8.01</w:t>
-      </w:r>
-      <w:r>
-        <w:noBreakHyphen/>
-      </w:r>
-      <w:r>
-        <w:t xml:space="preserve">626,</w:t>
+        <w:t xml:space="preserve">The fact that this Court denied the Department’s petition for review of the injunction under Code § 8.01-⁠626,</w:t>
       </w:r>
       <w:r>
         <w:t xml:space="preserve"> </w:t>
@@ -16093,6 +15881,15 @@
       <w:ind w:firstLine="0"/>
     </w:pPr>
   </w:style>
+  <w:style w:type="paragraph" w:customStyle="1" w:styleId="BodyTextKeep">
+    <w:name w:val="Body Text Keep"/>
+    <w:basedOn w:val="BodyText"/>
+    <w:qFormat/>
+    <w:pPr>
+      <w:keepNext/>
+      <w:keepLines/>
+    </w:pPr>
+  </w:style>
   <w:style w:type="paragraph" w:customStyle="1" w:styleId="XdList1">
     <w:name w:val="XdList 1"/>
     <w:basedOn w:val="Normal"/>
@@ -16145,6 +15942,33 @@
     <w:pPr>
       <w:spacing w:before="0" w:after="0" w:line="322" w:lineRule="exact"/>
       <w:ind w:left="2160" w:hanging="720"/>
+    </w:pPr>
+  </w:style>
+  <w:style w:type="paragraph" w:customStyle="1" w:styleId="XdQuoteList1">
+    <w:name w:val="Xd Quote List 1"/>
+    <w:basedOn w:val="Normal"/>
+    <w:qFormat/>
+    <w:pPr>
+      <w:spacing w:before="0" w:after="0" w:line="322" w:lineRule="exact"/>
+      <w:ind w:left="1440" w:right="720" w:hanging="720"/>
+    </w:pPr>
+  </w:style>
+  <w:style w:type="paragraph" w:customStyle="1" w:styleId="XdQuoteList2">
+    <w:name w:val="Xd Quote List 2"/>
+    <w:basedOn w:val="Normal"/>
+    <w:qFormat/>
+    <w:pPr>
+      <w:spacing w:before="0" w:after="0" w:line="322" w:lineRule="exact"/>
+      <w:ind w:left="2160" w:right="720" w:hanging="720"/>
+    </w:pPr>
+  </w:style>
+  <w:style w:type="paragraph" w:customStyle="1" w:styleId="XdQuoteList3">
+    <w:name w:val="Xd Quote List 3"/>
+    <w:basedOn w:val="Normal"/>
+    <w:qFormat/>
+    <w:pPr>
+      <w:spacing w:before="0" w:after="0" w:line="322" w:lineRule="exact"/>
+      <w:ind w:left="2880" w:right="720" w:hanging="720"/>
     </w:pPr>
   </w:style>
   <w:style w:type="paragraph" w:customStyle="1" w:styleId="SourceCode">

</xml_diff>

<commit_message>
va petition-for-discretionary-review gated: footnote.widows keeps the heading III and its note-calling paragraph together in every engine; tier 1 0 failed and XENG-001..003 pass on typst, latex and docx (714/714); cross_engine: gate (fb-595.54.35)
Co-Authored-By: Claude Opus 5.5 <noreply@anthropic.com>
</commit_message>
<xml_diff>
--- a/courts/fourth-circuit/virginia/state/supreme-court/petition-for-discretionary-review/usage/OUTPUT-petition-for-discretionary-review.docx
+++ b/courts/fourth-circuit/virginia/state/supreme-court/petition-for-discretionary-review/usage/OUTPUT-petition-for-discretionary-review.docx
@@ -2520,7 +2520,7 @@
         <w:tab/>
       </w:r>
       <w:r>
-        <w:t xml:space="preserve">21</w:t>
+        <w:t xml:space="preserve">22</w:t>
       </w:r>
     </w:p>
     <w:p>
@@ -2888,7 +2888,7 @@
         <w:tab/>
       </w:r>
       <w:r>
-        <w:t xml:space="preserve">24</w:t>
+        <w:t xml:space="preserve">25</w:t>
       </w:r>
     </w:p>
     <w:p>
@@ -3725,7 +3725,7 @@
         <w:tab/>
       </w:r>
       <w:r>
-        <w:t xml:space="preserve">22</w:t>
+        <w:t xml:space="preserve">23</w:t>
       </w:r>
     </w:p>
     <w:p>
@@ -4001,7 +4001,7 @@
         <w:tab/>
       </w:r>
       <w:r>
-        <w:t xml:space="preserve">16, 18</w:t>
+        <w:t xml:space="preserve">16, 19</w:t>
       </w:r>
     </w:p>
     <w:p>
@@ -4124,7 +4124,7 @@
         <w:tab/>
       </w:r>
       <w:r>
-        <w:t xml:space="preserve">23</w:t>
+        <w:t xml:space="preserve">24</w:t>
       </w:r>
     </w:p>
     <w:p>
@@ -4739,7 +4739,7 @@
         <w:tab/>
       </w:r>
       <w:r>
-        <w:t xml:space="preserve">26</w:t>
+        <w:t xml:space="preserve">27</w:t>
       </w:r>
     </w:p>
     <w:p>
@@ -4749,7 +4749,7 @@
           <w:tab w:val="right" w:leader="dot" w:pos="9360"/>
         </w:tabs>
         <w:spacing w:before="80" w:after="0" w:line="322" w:lineRule="exact"/>
-        <w:ind w:left="576" w:right="3920" w:hanging="576"/>
+        <w:ind w:left="576" w:right="4760" w:hanging="576"/>
       </w:pPr>
       <w:r>
         <w:rPr>
@@ -4862,7 +4862,7 @@
         <w:tab/>
       </w:r>
       <w:r>
-        <w:t xml:space="preserve">1, 3, 6, 9, 10, 14, 19, 21, 22, 23, 26</w:t>
+        <w:t xml:space="preserve">1, 3, 6, 9, 10, 14, 19, 21, 22, 23, 24, 26, 27</w:t>
       </w:r>
     </w:p>
     <w:p>
@@ -5072,7 +5072,7 @@
         <w:tab/>
       </w:r>
       <w:r>
-        <w:t xml:space="preserve">12, 22</w:t>
+        <w:t xml:space="preserve">12, 23</w:t>
       </w:r>
     </w:p>
     <w:p>
@@ -5153,7 +5153,7 @@
         <w:tab/>
       </w:r>
       <w:r>
-        <w:t xml:space="preserve">25, 26</w:t>
+        <w:t xml:space="preserve">25, 26, 27</w:t>
       </w:r>
     </w:p>
     <w:p>
@@ -5332,7 +5332,7 @@
         <w:tab/>
       </w:r>
       <w:r>
-        <w:t xml:space="preserve">24</w:t>
+        <w:t xml:space="preserve">25</w:t>
       </w:r>
     </w:p>
     <w:p>
@@ -5624,7 +5624,7 @@
         <w:tab/>
       </w:r>
       <w:r>
-        <w:t xml:space="preserve">12, 22</w:t>
+        <w:t xml:space="preserve">12, 23</w:t>
       </w:r>
     </w:p>
     <w:p>
@@ -6218,7 +6218,7 @@
         <w:tab/>
       </w:r>
       <w:r>
-        <w:t xml:space="preserve">24, 25</w:t>
+        <w:t xml:space="preserve">25</w:t>
       </w:r>
     </w:p>
     <w:p>
@@ -7277,7 +7277,7 @@
     </w:p>
     <w:p>
       <w:pPr>
-        <w:pStyle w:val="BodyTextNote"/>
+        <w:pStyle w:val="BodyText"/>
       </w:pPr>
       <w:r>
         <w:t xml:space="preserve">1. The circuit court erred in concluding that the Department’s ALPR system is an “information system” under the Data Act because the ALPR system does not itself contain “the name, personal number, or other identifying particulars of a data subject.” Va. Code Ann. § 2.2-⁠3801.</w:t>
@@ -7342,7 +7342,7 @@
     </w:p>
     <w:p>
       <w:pPr>
-        <w:pStyle w:val="BodyTextNote"/>
+        <w:pStyle w:val="BodyText"/>
       </w:pPr>
       <w:r>
         <w:t xml:space="preserve">2. The circuit court erred in ruling that the Department’s creation of an “information system” consisting of passively acquired ALPR data violates the Data Act.</w:t>
@@ -7356,7 +7356,7 @@
     </w:p>
     <w:p>
       <w:pPr>
-        <w:pStyle w:val="BodyTextNote"/>
+        <w:pStyle w:val="BodyText"/>
       </w:pPr>
       <w:r>
         <w:t xml:space="preserve">3. The circuit court erred in enjoining the Department from creating and maintaining an information system that consists of information captured by ALPR cameras.</w:t>
@@ -10224,7 +10224,7 @@
     </w:p>
     <w:p>
       <w:pPr>
-        <w:pStyle w:val="BodyTextNote"/>
+        <w:pStyle w:val="BodyText"/>
       </w:pPr>
       <w:r>
         <w:t xml:space="preserve">“This Court has long recognized that ‘statutes are not to be considered as isolated fragments of law, but as a whole, or as parts of a great connected, homogeneous system, or a single and complete statutory arrangement.’”</w:t>
@@ -11899,7 +11899,7 @@
     </w:p>
     <w:p>
       <w:pPr>
-        <w:pStyle w:val="BodyTextNote"/>
+        <w:pStyle w:val="BodyText"/>
       </w:pPr>
       <w:r>
         <w:t xml:space="preserve">But officers can access the NCIC, VCIN, and DMV databases</w:t>
@@ -12465,7 +12465,7 @@
     </w:p>
     <w:p>
       <w:pPr>
-        <w:pStyle w:val="BodyTextNote"/>
+        <w:pStyle w:val="BodyText"/>
       </w:pPr>
       <w:r>
         <w:t xml:space="preserve">The Data Act does not prohibit agencies from collecting information or maintaining an information system. The Act expressly contemplates that agencies will create such information systems. It simply imposes requirements on them when they do so.</w:t>
@@ -12886,7 +12886,7 @@
     </w:p>
     <w:p>
       <w:pPr>
-        <w:pStyle w:val="BodyTextNote"/>
+        <w:pStyle w:val="BodyText"/>
       </w:pPr>
       <w:r>
         <w:t xml:space="preserve">The circuit court’s injunction is also fatally flawed.</w:t>

</xml_diff>